<commit_message>
Rev.1 of mPrest CV
</commit_message>
<xml_diff>
--- a/docs/Dmitry_Messerman_CV_mPrest.docx
+++ b/docs/Dmitry_Messerman_CV_mPrest.docx
@@ -153,6 +153,11 @@
           <w:highlight w:val="none"/>
         </w:rPr>
       </w:r>
+      <w:r>
+        <w:rPr>
+          <w:highlight w:val="none"/>
+        </w:rPr>
+      </w:r>
     </w:p>
     <w:p>
       <w:pPr>
@@ -164,10 +169,32 @@
         </w:rPr>
       </w:pPr>
       <w:r>
+        <w:rPr>
+          <w:highlight w:val="none"/>
+        </w:rPr>
+        <w:t xml:space="preserve">M.Sc. in Electrophysics</w:t>
+      </w:r>
+      <w:r>
+        <w:rPr>
+          <w:highlight w:val="none"/>
+        </w:rPr>
+      </w:r>
+      <w:r/>
+    </w:p>
+    <w:p>
+      <w:pPr>
+        <w:pBdr/>
+        <w:spacing w:after="0"/>
+        <w:ind w:left="-284"/>
+        <w:rPr>
+          <w:highlight w:val="none"/>
+        </w:rPr>
+      </w:pPr>
+      <w:r>
         <w:t xml:space="preserve">EDA </w:t>
       </w:r>
       <w:r>
-        <w:t xml:space="preserve">CAD tool expert with over 20 years of experience in the development, support, and deployment of Computer Aided Design </w:t>
+        <w:t xml:space="preserve">CAD tool expert with over 20 years of multi-disciplinary experience in the development, support, and deployment of Computer Aided Design </w:t>
       </w:r>
       <w:r>
         <w:t xml:space="preserve">and </w:t>
@@ -258,7 +285,9 @@
         <w:pBdr/>
         <w:spacing w:after="0"/>
         <w:ind w:left="-425"/>
-        <w:rPr/>
+        <w:rPr>
+          <w:highlight w:val="none"/>
+        </w:rPr>
       </w:pPr>
       <w:r>
         <w:rPr>
@@ -304,37 +333,7 @@
         <w:t xml:space="preserve"> </w:t>
       </w:r>
       <w:r>
-        <w:t xml:space="preserve">tools in multiple areas:</w:t>
-      </w:r>
-      <w:r/>
-    </w:p>
-    <w:p>
-      <w:pPr>
-        <w:pStyle w:val="989"/>
-        <w:numPr>
-          <w:ilvl w:val="0"/>
-          <w:numId w:val="27"/>
-        </w:numPr>
-        <w:pBdr/>
-        <w:spacing w:after="0"/>
-        <w:ind/>
-        <w:rPr>
-          <w:highlight w:val="none"/>
-        </w:rPr>
-      </w:pPr>
-      <w:r>
-        <w:rPr>
-          <w:sz w:val="20"/>
-          <w:szCs w:val="20"/>
-          <w:highlight w:val="none"/>
-        </w:rPr>
-        <w:t xml:space="preserve">Modeling parasitic effects in VLSI design – has been used in production for ~10 years</w:t>
-      </w:r>
-      <w:r>
-        <w:rPr>
-          <w:highlight w:val="none"/>
-        </w:rPr>
-        <w:t xml:space="preserve">, patent granted</w:t>
+        <w:t xml:space="preserve">tools in multiple areas</w:t>
       </w:r>
       <w:r>
         <w:rPr>
@@ -347,6 +346,133 @@
         <w:pStyle w:val="989"/>
         <w:numPr>
           <w:ilvl w:val="0"/>
+          <w:numId w:val="36"/>
+        </w:numPr>
+        <w:pBdr/>
+        <w:spacing w:after="0"/>
+        <w:ind/>
+        <w:rPr>
+          <w:rFonts w:ascii="Cambria" w:hAnsi="Cambria" w:eastAsia="Cambria" w:cs="Cambria"/>
+          <w:color w:val="000000"/>
+          <w:sz w:val="20"/>
+          <w:szCs w:val="20"/>
+        </w:rPr>
+      </w:pPr>
+      <w:r>
+        <w:rPr>
+          <w:rFonts w:ascii="Cambria" w:hAnsi="Cambria" w:eastAsia="Cambria" w:cs="Cambria"/>
+          <w:color w:val="000000"/>
+          <w:sz w:val="20"/>
+          <w:szCs w:val="20"/>
+        </w:rPr>
+        <w:t xml:space="preserve">Translated user and system requirements into working solutions</w:t>
+      </w:r>
+      <w:r>
+        <w:rPr>
+          <w:rFonts w:ascii="Cambria" w:hAnsi="Cambria" w:eastAsia="Cambria" w:cs="Cambria"/>
+          <w:color w:val="000000"/>
+          <w:sz w:val="20"/>
+          <w:szCs w:val="20"/>
+        </w:rPr>
+      </w:r>
+    </w:p>
+    <w:p>
+      <w:pPr>
+        <w:pStyle w:val="989"/>
+        <w:numPr>
+          <w:ilvl w:val="0"/>
+          <w:numId w:val="36"/>
+        </w:numPr>
+        <w:pBdr/>
+        <w:spacing w:after="0"/>
+        <w:ind/>
+        <w:rPr>
+          <w:rFonts w:ascii="Cambria" w:hAnsi="Cambria" w:eastAsia="Cambria" w:cs="Cambria"/>
+          <w:color w:val="000000"/>
+          <w:sz w:val="20"/>
+          <w:szCs w:val="20"/>
+        </w:rPr>
+      </w:pPr>
+      <w:r>
+        <w:rPr>
+          <w:rFonts w:ascii="Cambria" w:hAnsi="Cambria" w:eastAsia="Cambria" w:cs="Cambria"/>
+          <w:color w:val="000000"/>
+          <w:sz w:val="20"/>
+          <w:szCs w:val="20"/>
+        </w:rPr>
+      </w:r>
+      <w:r>
+        <w:rPr>
+          <w:rFonts w:ascii="Cambria" w:hAnsi="Cambria" w:eastAsia="Cambria" w:cs="Cambria"/>
+          <w:color w:val="000000"/>
+          <w:sz w:val="20"/>
+          <w:szCs w:val="20"/>
+        </w:rPr>
+        <w:t xml:space="preserve">Led cross-team engineering efforts</w:t>
+      </w:r>
+      <w:r>
+        <w:rPr>
+          <w:rFonts w:ascii="Cambria" w:hAnsi="Cambria" w:eastAsia="Cambria" w:cs="Cambria"/>
+          <w:color w:val="000000"/>
+          <w:sz w:val="20"/>
+          <w:szCs w:val="20"/>
+        </w:rPr>
+      </w:r>
+      <w:r>
+        <w:rPr>
+          <w:sz w:val="20"/>
+          <w:szCs w:val="20"/>
+        </w:rPr>
+      </w:r>
+    </w:p>
+    <w:p>
+      <w:pPr>
+        <w:pStyle w:val="989"/>
+        <w:numPr>
+          <w:ilvl w:val="0"/>
+          <w:numId w:val="36"/>
+        </w:numPr>
+        <w:pBdr/>
+        <w:spacing w:after="0"/>
+        <w:ind/>
+        <w:rPr>
+          <w:rFonts w:ascii="Cambria" w:hAnsi="Cambria" w:eastAsia="Cambria" w:cs="Cambria"/>
+          <w:color w:val="000000"/>
+          <w:sz w:val="20"/>
+          <w:szCs w:val="20"/>
+        </w:rPr>
+      </w:pPr>
+      <w:r>
+        <w:rPr>
+          <w:rFonts w:ascii="Cambria" w:hAnsi="Cambria" w:eastAsia="Cambria" w:cs="Cambria"/>
+          <w:color w:val="000000"/>
+          <w:sz w:val="20"/>
+          <w:szCs w:val="20"/>
+        </w:rPr>
+        <w:t xml:space="preserve">Worked directly with internal stakeholders and leading EDA vendors</w:t>
+      </w:r>
+      <w:r>
+        <w:rPr>
+          <w:rFonts w:ascii="Cambria" w:hAnsi="Cambria" w:eastAsia="Cambria" w:cs="Cambria"/>
+          <w:color w:val="000000"/>
+          <w:sz w:val="20"/>
+          <w:szCs w:val="20"/>
+        </w:rPr>
+      </w:r>
+      <w:r>
+        <w:rPr>
+          <w:rFonts w:ascii="Cambria" w:hAnsi="Cambria" w:eastAsia="Cambria" w:cs="Cambria"/>
+          <w:color w:val="000000"/>
+          <w:sz w:val="20"/>
+          <w:szCs w:val="20"/>
+        </w:rPr>
+      </w:r>
+    </w:p>
+    <w:p>
+      <w:pPr>
+        <w:pStyle w:val="989"/>
+        <w:numPr>
+          <w:ilvl w:val="0"/>
           <w:numId w:val="27"/>
         </w:numPr>
         <w:pBdr/>
@@ -360,8 +486,11 @@
       </w:pPr>
       <w:r>
         <w:rPr>
+          <w:sz w:val="20"/>
+          <w:szCs w:val="20"/>
           <w:highlight w:val="none"/>
         </w:rPr>
+        <w:t xml:space="preserve">Led development of parasitic networks synthesis from VLSI design layout</w:t>
       </w:r>
       <w:r>
         <w:rPr>
@@ -369,7 +498,6 @@
           <w:szCs w:val="20"/>
           <w:highlight w:val="none"/>
         </w:rPr>
-        <w:t xml:space="preserve">Reliability validation of  VLSI design – has been used in production for ~20 years</w:t>
       </w:r>
       <w:r>
         <w:rPr>
@@ -383,14 +511,143 @@
       <w:pPr>
         <w:pStyle w:val="989"/>
         <w:numPr>
+          <w:ilvl w:val="1"/>
+          <w:numId w:val="27"/>
+        </w:numPr>
+        <w:pBdr/>
+        <w:spacing w:after="0"/>
+        <w:ind/>
+        <w:rPr>
+          <w:sz w:val="20"/>
+          <w:szCs w:val="20"/>
+          <w:highlight w:val="none"/>
+        </w:rPr>
+      </w:pPr>
+      <w:r>
+        <w:rPr>
+          <w:sz w:val="20"/>
+          <w:szCs w:val="20"/>
+          <w:highlight w:val="none"/>
+        </w:rPr>
+        <w:t xml:space="preserve">Developed heuristics for accurate modeling of resistivity parasitic effects in VLSI design with O(N) complexity – has been used in production for ~10 years</w:t>
+      </w:r>
+      <w:r>
+        <w:rPr>
+          <w:sz w:val="20"/>
+          <w:szCs w:val="20"/>
+          <w:highlight w:val="none"/>
+        </w:rPr>
+        <w:t xml:space="preserve">, patent granted</w:t>
+      </w:r>
+      <w:r>
+        <w:rPr>
+          <w:sz w:val="20"/>
+          <w:szCs w:val="20"/>
+          <w:highlight w:val="none"/>
+        </w:rPr>
+      </w:r>
+      <w:r>
+        <w:rPr>
+          <w:sz w:val="20"/>
+          <w:szCs w:val="20"/>
+          <w:highlight w:val="none"/>
+        </w:rPr>
+      </w:r>
+    </w:p>
+    <w:p>
+      <w:pPr>
+        <w:pStyle w:val="989"/>
+        <w:numPr>
           <w:ilvl w:val="0"/>
           <w:numId w:val="27"/>
         </w:numPr>
         <w:pBdr/>
         <w:spacing w:after="0"/>
         <w:ind/>
-        <w:rPr/>
-      </w:pPr>
+        <w:rPr>
+          <w:sz w:val="20"/>
+          <w:szCs w:val="20"/>
+          <w:highlight w:val="none"/>
+        </w:rPr>
+      </w:pPr>
+      <w:r>
+        <w:rPr>
+          <w:sz w:val="20"/>
+          <w:szCs w:val="20"/>
+          <w:highlight w:val="none"/>
+        </w:rPr>
+      </w:r>
+      <w:r>
+        <w:rPr>
+          <w:sz w:val="20"/>
+          <w:szCs w:val="20"/>
+          <w:highlight w:val="none"/>
+        </w:rPr>
+        <w:t xml:space="preserve">Led development of Reliability Validation tool for  VLSI design – has been used in production for ~20 years</w:t>
+      </w:r>
+      <w:r>
+        <w:rPr>
+          <w:sz w:val="20"/>
+          <w:szCs w:val="20"/>
+          <w:highlight w:val="none"/>
+        </w:rPr>
+      </w:r>
+      <w:r>
+        <w:rPr>
+          <w:sz w:val="20"/>
+          <w:szCs w:val="20"/>
+          <w:highlight w:val="none"/>
+        </w:rPr>
+      </w:r>
+    </w:p>
+    <w:p>
+      <w:pPr>
+        <w:pStyle w:val="989"/>
+        <w:numPr>
+          <w:ilvl w:val="0"/>
+          <w:numId w:val="34"/>
+        </w:numPr>
+        <w:pBdr/>
+        <w:spacing w:after="0"/>
+        <w:ind/>
+        <w:rPr>
+          <w:sz w:val="20"/>
+          <w:szCs w:val="20"/>
+        </w:rPr>
+      </w:pPr>
+      <w:r>
+        <w:rPr>
+          <w:sz w:val="20"/>
+          <w:szCs w:val="20"/>
+        </w:rPr>
+        <w:t xml:space="preserve">Developed novice algorithm for fast inductance extraction from the design layout – patent granted</w:t>
+      </w:r>
+      <w:r>
+        <w:rPr>
+          <w:sz w:val="20"/>
+          <w:szCs w:val="20"/>
+        </w:rPr>
+      </w:r>
+      <w:r>
+        <w:rPr>
+          <w:sz w:val="20"/>
+          <w:szCs w:val="20"/>
+        </w:rPr>
+      </w:r>
+      <w:r>
+        <w:rPr>
+          <w:sz w:val="20"/>
+          <w:szCs w:val="20"/>
+          <w:highlight w:val="none"/>
+        </w:rPr>
+      </w:r>
+      <w:r>
+        <w:rPr>
+          <w:sz w:val="20"/>
+          <w:szCs w:val="20"/>
+          <w:highlight w:val="none"/>
+        </w:rPr>
+      </w:r>
       <w:r>
         <w:rPr>
           <w:sz w:val="20"/>
@@ -403,23 +660,166 @@
           <w:sz w:val="20"/>
           <w:szCs w:val="20"/>
         </w:rPr>
-        <w:t xml:space="preserve">Surrogate modeling of silicon heat</w:t>
+      </w:r>
+    </w:p>
+    <w:p>
+      <w:pPr>
+        <w:pStyle w:val="989"/>
+        <w:numPr>
+          <w:ilvl w:val="0"/>
+          <w:numId w:val="27"/>
+        </w:numPr>
+        <w:pBdr/>
+        <w:spacing w:after="0"/>
+        <w:ind/>
+        <w:rPr>
+          <w:sz w:val="20"/>
+          <w:szCs w:val="20"/>
+          <w:highlight w:val="none"/>
+        </w:rPr>
+      </w:pPr>
+      <w:r>
+        <w:rPr>
+          <w:sz w:val="20"/>
+          <w:szCs w:val="20"/>
+          <w:highlight w:val="none"/>
+        </w:rPr>
+        <w:t xml:space="preserve">Deployed novice </w:t>
       </w:r>
       <w:r>
         <w:rPr>
           <w:sz w:val="20"/>
           <w:szCs w:val="20"/>
+          <w:highlight w:val="none"/>
         </w:rPr>
-        <w:t xml:space="preserve"> dissipation in tester environment </w:t>
+        <w:t xml:space="preserve">multi-grid algorithm</w:t>
       </w:r>
       <w:r>
         <w:rPr>
           <w:sz w:val="20"/>
           <w:szCs w:val="20"/>
+          <w:highlight w:val="none"/>
         </w:rPr>
-        <w:t xml:space="preserve">based on diffusion equations solver</w:t>
+        <w:t xml:space="preserve"> for CPU power grid (about 10</w:t>
       </w:r>
-      <w:r/>
+      <w:r>
+        <w:rPr>
+          <w:sz w:val="20"/>
+          <w:szCs w:val="20"/>
+          <w:highlight w:val="none"/>
+          <w:vertAlign w:val="superscript"/>
+        </w:rPr>
+        <w:t xml:space="preserve">8</w:t>
+      </w:r>
+      <w:r>
+        <w:rPr>
+          <w:sz w:val="20"/>
+          <w:szCs w:val="20"/>
+          <w:highlight w:val="none"/>
+        </w:rPr>
+        <w:t xml:space="preserve"> elements) simulation</w:t>
+      </w:r>
+      <w:r>
+        <w:rPr>
+          <w:sz w:val="20"/>
+          <w:szCs w:val="20"/>
+          <w:highlight w:val="none"/>
+        </w:rPr>
+        <w:t xml:space="preserve">  with O(N) complexity</w:t>
+      </w:r>
+      <w:r>
+        <w:rPr>
+          <w:sz w:val="20"/>
+          <w:szCs w:val="20"/>
+          <w:highlight w:val="none"/>
+        </w:rPr>
+      </w:r>
+      <w:r>
+        <w:rPr>
+          <w:sz w:val="20"/>
+          <w:szCs w:val="20"/>
+          <w:highlight w:val="none"/>
+        </w:rPr>
+      </w:r>
+    </w:p>
+    <w:p>
+      <w:pPr>
+        <w:pStyle w:val="989"/>
+        <w:numPr>
+          <w:ilvl w:val="0"/>
+          <w:numId w:val="27"/>
+        </w:numPr>
+        <w:pBdr/>
+        <w:spacing w:after="0"/>
+        <w:ind/>
+        <w:rPr>
+          <w:sz w:val="20"/>
+          <w:szCs w:val="20"/>
+          <w:highlight w:val="none"/>
+        </w:rPr>
+      </w:pPr>
+      <w:r>
+        <w:rPr>
+          <w:sz w:val="20"/>
+          <w:szCs w:val="20"/>
+          <w:highlight w:val="none"/>
+        </w:rPr>
+        <w:t xml:space="preserve">Developed </w:t>
+      </w:r>
+      <w:r>
+        <w:rPr>
+          <w:sz w:val="20"/>
+          <w:szCs w:val="20"/>
+          <w:highlight w:val="none"/>
+        </w:rPr>
+        <w:t xml:space="preserve">surrogate model for silicon heat dissipation in tester environment based on diffusion equations solver</w:t>
+      </w:r>
+      <w:r>
+        <w:rPr>
+          <w:sz w:val="20"/>
+          <w:szCs w:val="20"/>
+          <w:highlight w:val="none"/>
+        </w:rPr>
+      </w:r>
+      <w:r>
+        <w:rPr>
+          <w:sz w:val="20"/>
+          <w:szCs w:val="20"/>
+          <w:highlight w:val="none"/>
+        </w:rPr>
+      </w:r>
+    </w:p>
+    <w:p>
+      <w:pPr>
+        <w:pStyle w:val="989"/>
+        <w:numPr>
+          <w:ilvl w:val="1"/>
+          <w:numId w:val="27"/>
+        </w:numPr>
+        <w:pBdr/>
+        <w:spacing w:after="0"/>
+        <w:ind/>
+        <w:rPr>
+          <w:sz w:val="20"/>
+          <w:szCs w:val="20"/>
+          <w:highlight w:val="none"/>
+        </w:rPr>
+      </w:pPr>
+      <w:r>
+        <w:rPr>
+          <w:sz w:val="20"/>
+          <w:szCs w:val="20"/>
+          <w:highlight w:val="none"/>
+        </w:rPr>
+        <w:t xml:space="preserve">Found design issue in the CPU tester, which led to DUT (Device Under Test) overheating</w:t>
+      </w:r>
+      <w:r>
+        <w:rPr>
+          <w:sz w:val="20"/>
+          <w:szCs w:val="20"/>
+          <w:highlight w:val="none"/>
+        </w:rPr>
+      </w:r>
     </w:p>
     <w:p>
       <w:pPr>
@@ -588,6 +988,7 @@
           <w:sz w:val="20"/>
           <w:szCs w:val="20"/>
         </w:rPr>
+        <w:t xml:space="preserve">. </w:t>
       </w:r>
       <w:r>
         <w:rPr>
@@ -598,42 +999,54 @@
     </w:p>
     <w:p>
       <w:pPr>
+        <w:pStyle w:val="989"/>
+        <w:numPr>
+          <w:ilvl w:val="1"/>
+          <w:numId w:val="22"/>
+        </w:numPr>
         <w:pBdr/>
         <w:spacing w:after="0"/>
-        <w:ind w:left="-425"/>
-        <w:rPr/>
+        <w:ind/>
+        <w:rPr>
+          <w:sz w:val="20"/>
+          <w:szCs w:val="20"/>
+        </w:rPr>
       </w:pPr>
       <w:r>
+        <w:rPr>
+          <w:sz w:val="20"/>
+          <w:szCs w:val="20"/>
+          <w:highlight w:val="none"/>
+        </w:rPr>
+        <w:t xml:space="preserve">Found a major flaw in CPU architecture</w:t>
+      </w:r>
+      <w:r>
+        <w:rPr>
+          <w:sz w:val="20"/>
+          <w:szCs w:val="20"/>
+          <w:highlight w:val="none"/>
+        </w:rPr>
+      </w:r>
+    </w:p>
+    <w:p>
+      <w:pPr>
+        <w:pBdr/>
+        <w:spacing w:after="0"/>
+        <w:ind w:right="0" w:firstLine="0" w:left="-450"/>
+        <w:rPr>
+          <w:sz w:val="20"/>
+          <w:szCs w:val="20"/>
+        </w:rPr>
+      </w:pPr>
+      <w:r>
+        <w:rPr>
+          <w:sz w:val="20"/>
+          <w:szCs w:val="20"/>
+        </w:rPr>
         <w:t xml:space="preserve">- </w:t>
       </w:r>
       <w:r>
-        <w:t xml:space="preserve">Development, customization and support of in-house </w:t>
-      </w:r>
-      <w:r>
-        <w:t xml:space="preserve">block and full chip level </w:t>
-      </w:r>
-      <w:r>
-        <w:t xml:space="preserve">VLSI </w:t>
-      </w:r>
-      <w:r>
-        <w:t xml:space="preserve">layout editors</w:t>
-      </w:r>
-      <w:r/>
-    </w:p>
-    <w:p>
-      <w:pPr>
-        <w:pBdr/>
-        <w:spacing w:after="0"/>
-        <w:ind w:left="-425"/>
-        <w:rPr>
-          <w:b/>
-          <w:bCs/>
-          <w:sz w:val="20"/>
-          <w:szCs w:val="20"/>
-        </w:rPr>
-      </w:pPr>
-      <w:r>
-        <w:t xml:space="preserve">- Recognized for exceptional debugging and problem</w:t>
+        <w:t xml:space="preserve">Recognized for exceptional debugging and problem</w:t>
       </w:r>
       <w:r>
         <w:t xml:space="preserve">-</w:t>
@@ -651,8 +1064,57 @@
         <w:t xml:space="preserve"> and Linux</w:t>
       </w:r>
       <w:r>
-        <w:br/>
+        <w:rPr>
+          <w:sz w:val="20"/>
+          <w:szCs w:val="20"/>
+        </w:rPr>
       </w:r>
+      <w:r/>
+    </w:p>
+    <w:p>
+      <w:pPr>
+        <w:pBdr/>
+        <w:spacing w:after="0"/>
+        <w:ind w:firstLine="0" w:left="284"/>
+        <w:rPr>
+          <w:sz w:val="20"/>
+          <w:szCs w:val="20"/>
+        </w:rPr>
+      </w:pPr>
+      <w:r>
+        <w:rPr>
+          <w:sz w:val="20"/>
+          <w:szCs w:val="20"/>
+          <w:highlight w:val="none"/>
+        </w:rPr>
+      </w:r>
+      <w:r>
+        <w:rPr>
+          <w:sz w:val="20"/>
+          <w:szCs w:val="20"/>
+          <w:highlight w:val="none"/>
+        </w:rPr>
+      </w:r>
+      <w:r>
+        <w:rPr>
+          <w:sz w:val="20"/>
+          <w:szCs w:val="20"/>
+          <w:highlight w:val="none"/>
+        </w:rPr>
+      </w:r>
+    </w:p>
+    <w:p>
+      <w:pPr>
+        <w:pBdr/>
+        <w:spacing w:after="0"/>
+        <w:ind w:left="-425"/>
+        <w:rPr>
+          <w:b/>
+          <w:bCs/>
+          <w:sz w:val="20"/>
+          <w:szCs w:val="20"/>
+        </w:rPr>
+      </w:pPr>
       <w:r>
         <w:rPr>
           <w:b/>
@@ -661,25 +1123,6 @@
           <w:szCs w:val="20"/>
         </w:rPr>
       </w:r>
-      <w:r>
-        <w:rPr>
-          <w:b/>
-          <w:bCs/>
-          <w:sz w:val="20"/>
-          <w:szCs w:val="20"/>
-        </w:rPr>
-      </w:r>
-    </w:p>
-    <w:p>
-      <w:pPr>
-        <w:pBdr/>
-        <w:spacing/>
-        <w:ind w:left="-426"/>
-        <w:rPr>
-          <w:b/>
-          <w:bCs/>
-        </w:rPr>
-      </w:pPr>
       <w:r>
         <w:rPr>
           <w:b/>
@@ -720,6 +1163,14 @@
           <w:bCs/>
         </w:rPr>
       </w:r>
+      <w:r>
+        <w:rPr>
+          <w:b/>
+          <w:bCs/>
+          <w:sz w:val="20"/>
+          <w:szCs w:val="20"/>
+        </w:rPr>
+      </w:r>
     </w:p>
     <w:p>
       <w:pPr>
@@ -784,6 +1235,7 @@
         <w:rPr>
           <w:b/>
           <w:bCs/>
+          <w:highlight w:val="none"/>
         </w:rPr>
       </w:r>
       <w:r>
@@ -815,6 +1267,41 @@
       </w:r>
       <w:r>
         <w:rPr>
+          <w:rFonts w:ascii="Cambria" w:hAnsi="Cambria" w:eastAsia="Cambria" w:cs="Cambria"/>
+          <w:color w:val="000000"/>
+          <w:sz w:val="22"/>
+          <w:szCs w:val="22"/>
+          <w:highlight w:val="white"/>
+        </w:rPr>
+        <w:t xml:space="preserve">Modeling and simulation of large-scale power transmission systems, including transient phenomena, multi-conductor line behavior, corona discharged, lightning surge and environmental effect</w:t>
+      </w:r>
+      <w:r>
+        <w:rPr>
+          <w:highlight w:val="none"/>
+        </w:rPr>
+      </w:r>
+      <w:r>
+        <w:rPr>
+          <w:highlight w:val="none"/>
+        </w:rPr>
+      </w:r>
+    </w:p>
+    <w:p>
+      <w:pPr>
+        <w:pStyle w:val="989"/>
+        <w:numPr>
+          <w:ilvl w:val="1"/>
+          <w:numId w:val="23"/>
+        </w:numPr>
+        <w:pBdr/>
+        <w:spacing w:after="120"/>
+        <w:ind w:right="0" w:hanging="270" w:left="540"/>
+        <w:rPr>
+          <w:highlight w:val="none"/>
+        </w:rPr>
+      </w:pPr>
+      <w:r>
+        <w:rPr>
           <w:highlight w:val="none"/>
         </w:rPr>
         <w:t xml:space="preserve">Analysis of the environmental impact of electric fields from extra-high-voltage power lines</w:t>
@@ -824,17 +1311,22 @@
           <w:highlight w:val="none"/>
         </w:rPr>
       </w:r>
+      <w:r>
+        <w:rPr>
+          <w:highlight w:val="none"/>
+        </w:rPr>
+      </w:r>
     </w:p>
     <w:p>
       <w:pPr>
         <w:pStyle w:val="989"/>
         <w:numPr>
-          <w:ilvl w:val="0"/>
+          <w:ilvl w:val="1"/>
           <w:numId w:val="23"/>
         </w:numPr>
         <w:pBdr/>
         <w:spacing w:after="120"/>
-        <w:ind/>
+        <w:ind w:right="0" w:hanging="270" w:left="540"/>
         <w:rPr/>
       </w:pPr>
       <w:r>
@@ -846,7 +1338,7 @@
         <w:rPr>
           <w:highlight w:val="none"/>
         </w:rPr>
-        <w:t xml:space="preserve">Development of fundamental algorithms for calculating the modal parameters of multi-conductor power transmission lines, taking into account the characteristics of real soil.</w:t>
+        <w:t xml:space="preserve">Development of fundamental algorithms for calculating the modal parameters of multi-conductor power transmission lines, taking into account the characteristics of non-homogeneous soil.</w:t>
       </w:r>
       <w:r/>
     </w:p>
@@ -854,19 +1346,19 @@
       <w:pPr>
         <w:pStyle w:val="989"/>
         <w:numPr>
-          <w:ilvl w:val="0"/>
+          <w:ilvl w:val="1"/>
           <w:numId w:val="23"/>
         </w:numPr>
         <w:pBdr/>
         <w:spacing w:after="120"/>
-        <w:ind/>
+        <w:ind w:right="0" w:hanging="270" w:left="540"/>
         <w:rPr/>
       </w:pPr>
       <w:r>
         <w:rPr>
           <w:highlight w:val="none"/>
         </w:rPr>
-        <w:t xml:space="preserve">Investigation of the distortion and attenuation of lightning surge waves in long-span power transmission lines</w:t>
+        <w:t xml:space="preserve">Modeling of the distortion and attenuation of lightning surge waves in long-span power transmission lines</w:t>
       </w:r>
       <w:r>
         <w:rPr>
@@ -881,7 +1373,9 @@
         <w:pBdr/>
         <w:spacing w:before="0"/>
         <w:ind w:left="-284"/>
-        <w:rPr/>
+        <w:rPr>
+          <w:highlight w:val="none"/>
+        </w:rPr>
       </w:pPr>
       <w:r>
         <w:t xml:space="preserve">Education</w:t>
@@ -1429,6 +1923,11 @@
           <w:highlight w:val="none"/>
         </w:rPr>
       </w:r>
+      <w:r>
+        <w:rPr>
+          <w:highlight w:val="none"/>
+        </w:rPr>
+      </w:r>
     </w:p>
     <w:p>
       <w:pPr>
@@ -1525,6 +2024,7 @@
           <w:rFonts w:ascii="Arial" w:hAnsi="Arial" w:eastAsia="Arial" w:cs="Arial"/>
           <w:color w:val="000000"/>
           <w:sz w:val="21"/>
+          <w:szCs w:val="21"/>
           <w:highlight w:val="none"/>
         </w:rPr>
       </w:r>
@@ -1580,6 +2080,15 @@
           <w:sz w:val="21"/>
         </w:rPr>
         <w:t xml:space="preserve">d can-do attitude. No matter how challenging the task, Dmitry was always the person I could rely on to deliver results.</w:t>
+      </w:r>
+      <w:r>
+        <w:rPr>
+          <w:rFonts w:ascii="Arial" w:hAnsi="Arial" w:eastAsia="Arial" w:cs="Arial"/>
+          <w:color w:val="000000"/>
+          <w:sz w:val="21"/>
+          <w:szCs w:val="21"/>
+          <w:highlight w:val="none"/>
+        </w:rPr>
       </w:r>
       <w:r>
         <w:rPr>
@@ -1687,9 +2196,8 @@
       <w:r>
         <w:rPr>
           <w:rFonts w:ascii="Arial" w:hAnsi="Arial" w:eastAsia="Arial" w:cs="Arial"/>
-          <w:color w:val="000000"/>
           <w:sz w:val="21"/>
-          <w:highlight w:val="none"/>
+          <w:szCs w:val="21"/>
         </w:rPr>
       </w:r>
       <w:r>
@@ -1758,6 +2266,15 @@
           <w:highlight w:val="none"/>
         </w:rPr>
       </w:r>
+      <w:r>
+        <w:rPr>
+          <w:rFonts w:ascii="Arial" w:hAnsi="Arial" w:eastAsia="Arial" w:cs="Arial"/>
+          <w:color w:val="000000"/>
+          <w:sz w:val="21"/>
+          <w:szCs w:val="21"/>
+          <w:highlight w:val="none"/>
+        </w:rPr>
+      </w:r>
     </w:p>
     <w:p>
       <w:pPr>
@@ -1780,7 +2297,6 @@
         <w:rPr>
           <w:sz w:val="20"/>
           <w:szCs w:val="20"/>
-          <w:highlight w:val="none"/>
         </w:rPr>
       </w:r>
       <w:r>
@@ -5780,6 +6296,1329 @@
         <w:pBdr/>
         <w:spacing/>
         <w:ind w:hanging="360" w:left="6044"/>
+      </w:pPr>
+      <w:rPr>
+        <w:rFonts w:hint="default" w:ascii="Wingdings" w:hAnsi="Wingdings" w:eastAsia="Wingdings" w:cs="Wingdings"/>
+      </w:rPr>
+      <w:start w:val="1"/>
+      <w:suff w:val="tab"/>
+    </w:lvl>
+  </w:abstractNum>
+  <w:abstractNum w:abstractNumId="27">
+    <w:nsid w:val="485DE4BC"/>
+    <w:lvl w:ilvl="0">
+      <w:isLgl w:val="false"/>
+      <w:lvlJc w:val="left"/>
+      <w:lvlText w:val="·"/>
+      <w:numFmt w:val="bullet"/>
+      <w:pPr>
+        <w:pBdr/>
+        <w:spacing/>
+        <w:ind w:hanging="360" w:left="284"/>
+      </w:pPr>
+      <w:rPr>
+        <w:rFonts w:hint="default" w:ascii="Symbol" w:hAnsi="Symbol" w:eastAsia="Symbol" w:cs="Symbol"/>
+      </w:rPr>
+      <w:start w:val="1"/>
+      <w:suff w:val="tab"/>
+    </w:lvl>
+    <w:lvl w:ilvl="1">
+      <w:isLgl w:val="false"/>
+      <w:lvlJc w:val="left"/>
+      <w:lvlText w:val="o"/>
+      <w:numFmt w:val="bullet"/>
+      <w:pPr>
+        <w:pBdr/>
+        <w:spacing/>
+        <w:ind w:hanging="360" w:left="1440"/>
+      </w:pPr>
+      <w:rPr>
+        <w:rFonts w:hint="default" w:ascii="Courier New" w:hAnsi="Courier New" w:eastAsia="Courier New" w:cs="Courier New"/>
+      </w:rPr>
+      <w:start w:val="1"/>
+      <w:suff w:val="tab"/>
+    </w:lvl>
+    <w:lvl w:ilvl="2">
+      <w:isLgl w:val="false"/>
+      <w:lvlJc w:val="left"/>
+      <w:lvlText w:val="§"/>
+      <w:numFmt w:val="bullet"/>
+      <w:pPr>
+        <w:pBdr/>
+        <w:spacing/>
+        <w:ind w:hanging="360" w:left="2160"/>
+      </w:pPr>
+      <w:rPr>
+        <w:rFonts w:hint="default" w:ascii="Wingdings" w:hAnsi="Wingdings" w:eastAsia="Wingdings" w:cs="Wingdings"/>
+      </w:rPr>
+      <w:start w:val="1"/>
+      <w:suff w:val="tab"/>
+    </w:lvl>
+    <w:lvl w:ilvl="3">
+      <w:isLgl w:val="false"/>
+      <w:lvlJc w:val="left"/>
+      <w:lvlText w:val="·"/>
+      <w:numFmt w:val="bullet"/>
+      <w:pPr>
+        <w:pBdr/>
+        <w:spacing/>
+        <w:ind w:hanging="360" w:left="2880"/>
+      </w:pPr>
+      <w:rPr>
+        <w:rFonts w:hint="default" w:ascii="Symbol" w:hAnsi="Symbol" w:eastAsia="Symbol" w:cs="Symbol"/>
+      </w:rPr>
+      <w:start w:val="1"/>
+      <w:suff w:val="tab"/>
+    </w:lvl>
+    <w:lvl w:ilvl="4">
+      <w:isLgl w:val="false"/>
+      <w:lvlJc w:val="left"/>
+      <w:lvlText w:val="o"/>
+      <w:numFmt w:val="bullet"/>
+      <w:pPr>
+        <w:pBdr/>
+        <w:spacing/>
+        <w:ind w:hanging="360" w:left="3600"/>
+      </w:pPr>
+      <w:rPr>
+        <w:rFonts w:hint="default" w:ascii="Courier New" w:hAnsi="Courier New" w:eastAsia="Courier New" w:cs="Courier New"/>
+      </w:rPr>
+      <w:start w:val="1"/>
+      <w:suff w:val="tab"/>
+    </w:lvl>
+    <w:lvl w:ilvl="5">
+      <w:isLgl w:val="false"/>
+      <w:lvlJc w:val="left"/>
+      <w:lvlText w:val="§"/>
+      <w:numFmt w:val="bullet"/>
+      <w:pPr>
+        <w:pBdr/>
+        <w:spacing/>
+        <w:ind w:hanging="360" w:left="4320"/>
+      </w:pPr>
+      <w:rPr>
+        <w:rFonts w:hint="default" w:ascii="Wingdings" w:hAnsi="Wingdings" w:eastAsia="Wingdings" w:cs="Wingdings"/>
+      </w:rPr>
+      <w:start w:val="1"/>
+      <w:suff w:val="tab"/>
+    </w:lvl>
+    <w:lvl w:ilvl="6">
+      <w:isLgl w:val="false"/>
+      <w:lvlJc w:val="left"/>
+      <w:lvlText w:val="·"/>
+      <w:numFmt w:val="bullet"/>
+      <w:pPr>
+        <w:pBdr/>
+        <w:spacing/>
+        <w:ind w:hanging="360" w:left="5040"/>
+      </w:pPr>
+      <w:rPr>
+        <w:rFonts w:hint="default" w:ascii="Symbol" w:hAnsi="Symbol" w:eastAsia="Symbol" w:cs="Symbol"/>
+      </w:rPr>
+      <w:start w:val="1"/>
+      <w:suff w:val="tab"/>
+    </w:lvl>
+    <w:lvl w:ilvl="7">
+      <w:isLgl w:val="false"/>
+      <w:lvlJc w:val="left"/>
+      <w:lvlText w:val="o"/>
+      <w:numFmt w:val="bullet"/>
+      <w:pPr>
+        <w:pBdr/>
+        <w:spacing/>
+        <w:ind w:hanging="360" w:left="5760"/>
+      </w:pPr>
+      <w:rPr>
+        <w:rFonts w:hint="default" w:ascii="Courier New" w:hAnsi="Courier New" w:eastAsia="Courier New" w:cs="Courier New"/>
+      </w:rPr>
+      <w:start w:val="1"/>
+      <w:suff w:val="tab"/>
+    </w:lvl>
+    <w:lvl w:ilvl="8">
+      <w:isLgl w:val="false"/>
+      <w:lvlJc w:val="left"/>
+      <w:lvlText w:val="§"/>
+      <w:numFmt w:val="bullet"/>
+      <w:pPr>
+        <w:pBdr/>
+        <w:spacing/>
+        <w:ind w:hanging="360" w:left="6480"/>
+      </w:pPr>
+      <w:rPr>
+        <w:rFonts w:hint="default" w:ascii="Wingdings" w:hAnsi="Wingdings" w:eastAsia="Wingdings" w:cs="Wingdings"/>
+      </w:rPr>
+      <w:start w:val="1"/>
+      <w:suff w:val="tab"/>
+    </w:lvl>
+  </w:abstractNum>
+  <w:abstractNum w:abstractNumId="28">
+    <w:nsid w:val="293B81B2"/>
+    <w:lvl w:ilvl="0">
+      <w:isLgl w:val="false"/>
+      <w:lvlJc w:val="left"/>
+      <w:lvlText w:val="·"/>
+      <w:numFmt w:val="bullet"/>
+      <w:pPr>
+        <w:pBdr/>
+        <w:spacing/>
+        <w:ind w:hanging="360" w:left="284"/>
+      </w:pPr>
+      <w:rPr>
+        <w:rFonts w:ascii="Symbol" w:hAnsi="Symbol" w:eastAsia="Symbol" w:cs="Symbol"/>
+      </w:rPr>
+      <w:start w:val="1"/>
+      <w:suff w:val="tab"/>
+    </w:lvl>
+    <w:lvl w:ilvl="1">
+      <w:isLgl w:val="false"/>
+      <w:lvlJc w:val="left"/>
+      <w:lvlText w:val="o"/>
+      <w:numFmt w:val="bullet"/>
+      <w:pPr>
+        <w:pBdr/>
+        <w:spacing/>
+        <w:ind w:hanging="360" w:left="1004"/>
+      </w:pPr>
+      <w:rPr>
+        <w:rFonts w:hint="default" w:ascii="Courier New" w:hAnsi="Courier New" w:eastAsia="Courier New" w:cs="Courier New"/>
+      </w:rPr>
+      <w:start w:val="1"/>
+      <w:suff w:val="tab"/>
+    </w:lvl>
+    <w:lvl w:ilvl="2">
+      <w:isLgl w:val="false"/>
+      <w:lvlJc w:val="left"/>
+      <w:lvlText w:val="§"/>
+      <w:numFmt w:val="bullet"/>
+      <w:pPr>
+        <w:pBdr/>
+        <w:spacing/>
+        <w:ind w:hanging="360" w:left="1724"/>
+      </w:pPr>
+      <w:rPr>
+        <w:rFonts w:hint="default" w:ascii="Wingdings" w:hAnsi="Wingdings" w:eastAsia="Wingdings" w:cs="Wingdings"/>
+      </w:rPr>
+      <w:start w:val="1"/>
+      <w:suff w:val="tab"/>
+    </w:lvl>
+    <w:lvl w:ilvl="3">
+      <w:isLgl w:val="false"/>
+      <w:lvlJc w:val="left"/>
+      <w:lvlText w:val="·"/>
+      <w:numFmt w:val="bullet"/>
+      <w:pPr>
+        <w:pBdr/>
+        <w:spacing/>
+        <w:ind w:hanging="360" w:left="2444"/>
+      </w:pPr>
+      <w:rPr>
+        <w:rFonts w:hint="default" w:ascii="Symbol" w:hAnsi="Symbol" w:eastAsia="Symbol" w:cs="Symbol"/>
+      </w:rPr>
+      <w:start w:val="1"/>
+      <w:suff w:val="tab"/>
+    </w:lvl>
+    <w:lvl w:ilvl="4">
+      <w:isLgl w:val="false"/>
+      <w:lvlJc w:val="left"/>
+      <w:lvlText w:val="o"/>
+      <w:numFmt w:val="bullet"/>
+      <w:pPr>
+        <w:pBdr/>
+        <w:spacing/>
+        <w:ind w:hanging="360" w:left="3164"/>
+      </w:pPr>
+      <w:rPr>
+        <w:rFonts w:hint="default" w:ascii="Courier New" w:hAnsi="Courier New" w:eastAsia="Courier New" w:cs="Courier New"/>
+      </w:rPr>
+      <w:start w:val="1"/>
+      <w:suff w:val="tab"/>
+    </w:lvl>
+    <w:lvl w:ilvl="5">
+      <w:isLgl w:val="false"/>
+      <w:lvlJc w:val="left"/>
+      <w:lvlText w:val="§"/>
+      <w:numFmt w:val="bullet"/>
+      <w:pPr>
+        <w:pBdr/>
+        <w:spacing/>
+        <w:ind w:hanging="360" w:left="3884"/>
+      </w:pPr>
+      <w:rPr>
+        <w:rFonts w:hint="default" w:ascii="Wingdings" w:hAnsi="Wingdings" w:eastAsia="Wingdings" w:cs="Wingdings"/>
+      </w:rPr>
+      <w:start w:val="1"/>
+      <w:suff w:val="tab"/>
+    </w:lvl>
+    <w:lvl w:ilvl="6">
+      <w:isLgl w:val="false"/>
+      <w:lvlJc w:val="left"/>
+      <w:lvlText w:val="·"/>
+      <w:numFmt w:val="bullet"/>
+      <w:pPr>
+        <w:pBdr/>
+        <w:spacing/>
+        <w:ind w:hanging="360" w:left="4604"/>
+      </w:pPr>
+      <w:rPr>
+        <w:rFonts w:hint="default" w:ascii="Symbol" w:hAnsi="Symbol" w:eastAsia="Symbol" w:cs="Symbol"/>
+      </w:rPr>
+      <w:start w:val="1"/>
+      <w:suff w:val="tab"/>
+    </w:lvl>
+    <w:lvl w:ilvl="7">
+      <w:isLgl w:val="false"/>
+      <w:lvlJc w:val="left"/>
+      <w:lvlText w:val="o"/>
+      <w:numFmt w:val="bullet"/>
+      <w:pPr>
+        <w:pBdr/>
+        <w:spacing/>
+        <w:ind w:hanging="360" w:left="5324"/>
+      </w:pPr>
+      <w:rPr>
+        <w:rFonts w:hint="default" w:ascii="Courier New" w:hAnsi="Courier New" w:eastAsia="Courier New" w:cs="Courier New"/>
+      </w:rPr>
+      <w:start w:val="1"/>
+      <w:suff w:val="tab"/>
+    </w:lvl>
+    <w:lvl w:ilvl="8">
+      <w:isLgl w:val="false"/>
+      <w:lvlJc w:val="left"/>
+      <w:lvlText w:val="§"/>
+      <w:numFmt w:val="bullet"/>
+      <w:pPr>
+        <w:pBdr/>
+        <w:spacing/>
+        <w:ind w:hanging="360" w:left="6044"/>
+      </w:pPr>
+      <w:rPr>
+        <w:rFonts w:hint="default" w:ascii="Wingdings" w:hAnsi="Wingdings" w:eastAsia="Wingdings" w:cs="Wingdings"/>
+      </w:rPr>
+      <w:start w:val="1"/>
+      <w:suff w:val="tab"/>
+    </w:lvl>
+  </w:abstractNum>
+  <w:abstractNum w:abstractNumId="29">
+    <w:nsid w:val="7AA650EC"/>
+    <w:lvl w:ilvl="0">
+      <w:isLgl w:val="false"/>
+      <w:lvlJc w:val="left"/>
+      <w:lvlText w:val="·"/>
+      <w:numFmt w:val="bullet"/>
+      <w:pPr>
+        <w:pBdr/>
+        <w:spacing/>
+        <w:ind w:hanging="360" w:left="934"/>
+      </w:pPr>
+      <w:rPr>
+        <w:rFonts w:hint="default" w:ascii="Symbol" w:hAnsi="Symbol" w:eastAsia="Symbol" w:cs="Symbol"/>
+      </w:rPr>
+      <w:start w:val="1"/>
+      <w:suff w:val="tab"/>
+    </w:lvl>
+    <w:lvl w:ilvl="1">
+      <w:isLgl w:val="false"/>
+      <w:lvlJc w:val="left"/>
+      <w:lvlText w:val="o"/>
+      <w:numFmt w:val="bullet"/>
+      <w:pPr>
+        <w:pBdr/>
+        <w:spacing/>
+        <w:ind w:hanging="360" w:left="1654"/>
+      </w:pPr>
+      <w:rPr>
+        <w:rFonts w:hint="default" w:ascii="Courier New" w:hAnsi="Courier New" w:eastAsia="Courier New" w:cs="Courier New"/>
+      </w:rPr>
+      <w:start w:val="1"/>
+      <w:suff w:val="tab"/>
+    </w:lvl>
+    <w:lvl w:ilvl="2">
+      <w:isLgl w:val="false"/>
+      <w:lvlJc w:val="left"/>
+      <w:lvlText w:val="§"/>
+      <w:numFmt w:val="bullet"/>
+      <w:pPr>
+        <w:pBdr/>
+        <w:spacing/>
+        <w:ind w:hanging="360" w:left="2374"/>
+      </w:pPr>
+      <w:rPr>
+        <w:rFonts w:hint="default" w:ascii="Wingdings" w:hAnsi="Wingdings" w:eastAsia="Wingdings" w:cs="Wingdings"/>
+      </w:rPr>
+      <w:start w:val="1"/>
+      <w:suff w:val="tab"/>
+    </w:lvl>
+    <w:lvl w:ilvl="3">
+      <w:isLgl w:val="false"/>
+      <w:lvlJc w:val="left"/>
+      <w:lvlText w:val="·"/>
+      <w:numFmt w:val="bullet"/>
+      <w:pPr>
+        <w:pBdr/>
+        <w:spacing/>
+        <w:ind w:hanging="360" w:left="3094"/>
+      </w:pPr>
+      <w:rPr>
+        <w:rFonts w:hint="default" w:ascii="Symbol" w:hAnsi="Symbol" w:eastAsia="Symbol" w:cs="Symbol"/>
+      </w:rPr>
+      <w:start w:val="1"/>
+      <w:suff w:val="tab"/>
+    </w:lvl>
+    <w:lvl w:ilvl="4">
+      <w:isLgl w:val="false"/>
+      <w:lvlJc w:val="left"/>
+      <w:lvlText w:val="o"/>
+      <w:numFmt w:val="bullet"/>
+      <w:pPr>
+        <w:pBdr/>
+        <w:spacing/>
+        <w:ind w:hanging="360" w:left="3814"/>
+      </w:pPr>
+      <w:rPr>
+        <w:rFonts w:hint="default" w:ascii="Courier New" w:hAnsi="Courier New" w:eastAsia="Courier New" w:cs="Courier New"/>
+      </w:rPr>
+      <w:start w:val="1"/>
+      <w:suff w:val="tab"/>
+    </w:lvl>
+    <w:lvl w:ilvl="5">
+      <w:isLgl w:val="false"/>
+      <w:lvlJc w:val="left"/>
+      <w:lvlText w:val="§"/>
+      <w:numFmt w:val="bullet"/>
+      <w:pPr>
+        <w:pBdr/>
+        <w:spacing/>
+        <w:ind w:hanging="360" w:left="4534"/>
+      </w:pPr>
+      <w:rPr>
+        <w:rFonts w:hint="default" w:ascii="Wingdings" w:hAnsi="Wingdings" w:eastAsia="Wingdings" w:cs="Wingdings"/>
+      </w:rPr>
+      <w:start w:val="1"/>
+      <w:suff w:val="tab"/>
+    </w:lvl>
+    <w:lvl w:ilvl="6">
+      <w:isLgl w:val="false"/>
+      <w:lvlJc w:val="left"/>
+      <w:lvlText w:val="·"/>
+      <w:numFmt w:val="bullet"/>
+      <w:pPr>
+        <w:pBdr/>
+        <w:spacing/>
+        <w:ind w:hanging="360" w:left="5254"/>
+      </w:pPr>
+      <w:rPr>
+        <w:rFonts w:hint="default" w:ascii="Symbol" w:hAnsi="Symbol" w:eastAsia="Symbol" w:cs="Symbol"/>
+      </w:rPr>
+      <w:start w:val="1"/>
+      <w:suff w:val="tab"/>
+    </w:lvl>
+    <w:lvl w:ilvl="7">
+      <w:isLgl w:val="false"/>
+      <w:lvlJc w:val="left"/>
+      <w:lvlText w:val="o"/>
+      <w:numFmt w:val="bullet"/>
+      <w:pPr>
+        <w:pBdr/>
+        <w:spacing/>
+        <w:ind w:hanging="360" w:left="5974"/>
+      </w:pPr>
+      <w:rPr>
+        <w:rFonts w:hint="default" w:ascii="Courier New" w:hAnsi="Courier New" w:eastAsia="Courier New" w:cs="Courier New"/>
+      </w:rPr>
+      <w:start w:val="1"/>
+      <w:suff w:val="tab"/>
+    </w:lvl>
+    <w:lvl w:ilvl="8">
+      <w:isLgl w:val="false"/>
+      <w:lvlJc w:val="left"/>
+      <w:lvlText w:val="§"/>
+      <w:numFmt w:val="bullet"/>
+      <w:pPr>
+        <w:pBdr/>
+        <w:spacing/>
+        <w:ind w:hanging="360" w:left="6694"/>
+      </w:pPr>
+      <w:rPr>
+        <w:rFonts w:hint="default" w:ascii="Wingdings" w:hAnsi="Wingdings" w:eastAsia="Wingdings" w:cs="Wingdings"/>
+      </w:rPr>
+      <w:start w:val="1"/>
+      <w:suff w:val="tab"/>
+    </w:lvl>
+  </w:abstractNum>
+  <w:abstractNum w:abstractNumId="30">
+    <w:nsid w:val="7BDFC76D"/>
+    <w:lvl w:ilvl="0">
+      <w:isLgl w:val="false"/>
+      <w:lvlJc w:val="left"/>
+      <w:lvlText w:val="–"/>
+      <w:numFmt w:val="bullet"/>
+      <w:pPr>
+        <w:pBdr/>
+        <w:spacing/>
+        <w:ind w:hanging="360" w:left="284"/>
+      </w:pPr>
+      <w:rPr>
+        <w:rFonts w:hint="default" w:ascii="Arial" w:hAnsi="Arial" w:eastAsia="Arial" w:cs="Arial"/>
+      </w:rPr>
+      <w:start w:val="1"/>
+      <w:suff w:val="tab"/>
+    </w:lvl>
+    <w:lvl w:ilvl="1">
+      <w:isLgl w:val="false"/>
+      <w:lvlJc w:val="left"/>
+      <w:lvlText w:val="o"/>
+      <w:numFmt w:val="bullet"/>
+      <w:pPr>
+        <w:pBdr/>
+        <w:spacing/>
+        <w:ind w:hanging="360" w:left="1004"/>
+      </w:pPr>
+      <w:rPr>
+        <w:rFonts w:hint="default" w:ascii="Courier New" w:hAnsi="Courier New" w:eastAsia="Courier New" w:cs="Courier New"/>
+      </w:rPr>
+      <w:start w:val="1"/>
+      <w:suff w:val="tab"/>
+    </w:lvl>
+    <w:lvl w:ilvl="2">
+      <w:isLgl w:val="false"/>
+      <w:lvlJc w:val="left"/>
+      <w:lvlText w:val="§"/>
+      <w:numFmt w:val="bullet"/>
+      <w:pPr>
+        <w:pBdr/>
+        <w:spacing/>
+        <w:ind w:hanging="360" w:left="1724"/>
+      </w:pPr>
+      <w:rPr>
+        <w:rFonts w:hint="default" w:ascii="Wingdings" w:hAnsi="Wingdings" w:eastAsia="Wingdings" w:cs="Wingdings"/>
+      </w:rPr>
+      <w:start w:val="1"/>
+      <w:suff w:val="tab"/>
+    </w:lvl>
+    <w:lvl w:ilvl="3">
+      <w:isLgl w:val="false"/>
+      <w:lvlJc w:val="left"/>
+      <w:lvlText w:val="·"/>
+      <w:numFmt w:val="bullet"/>
+      <w:pPr>
+        <w:pBdr/>
+        <w:spacing/>
+        <w:ind w:hanging="360" w:left="2444"/>
+      </w:pPr>
+      <w:rPr>
+        <w:rFonts w:hint="default" w:ascii="Symbol" w:hAnsi="Symbol" w:eastAsia="Symbol" w:cs="Symbol"/>
+      </w:rPr>
+      <w:start w:val="1"/>
+      <w:suff w:val="tab"/>
+    </w:lvl>
+    <w:lvl w:ilvl="4">
+      <w:isLgl w:val="false"/>
+      <w:lvlJc w:val="left"/>
+      <w:lvlText w:val="o"/>
+      <w:numFmt w:val="bullet"/>
+      <w:pPr>
+        <w:pBdr/>
+        <w:spacing/>
+        <w:ind w:hanging="360" w:left="3164"/>
+      </w:pPr>
+      <w:rPr>
+        <w:rFonts w:hint="default" w:ascii="Courier New" w:hAnsi="Courier New" w:eastAsia="Courier New" w:cs="Courier New"/>
+      </w:rPr>
+      <w:start w:val="1"/>
+      <w:suff w:val="tab"/>
+    </w:lvl>
+    <w:lvl w:ilvl="5">
+      <w:isLgl w:val="false"/>
+      <w:lvlJc w:val="left"/>
+      <w:lvlText w:val="§"/>
+      <w:numFmt w:val="bullet"/>
+      <w:pPr>
+        <w:pBdr/>
+        <w:spacing/>
+        <w:ind w:hanging="360" w:left="3884"/>
+      </w:pPr>
+      <w:rPr>
+        <w:rFonts w:hint="default" w:ascii="Wingdings" w:hAnsi="Wingdings" w:eastAsia="Wingdings" w:cs="Wingdings"/>
+      </w:rPr>
+      <w:start w:val="1"/>
+      <w:suff w:val="tab"/>
+    </w:lvl>
+    <w:lvl w:ilvl="6">
+      <w:isLgl w:val="false"/>
+      <w:lvlJc w:val="left"/>
+      <w:lvlText w:val="·"/>
+      <w:numFmt w:val="bullet"/>
+      <w:pPr>
+        <w:pBdr/>
+        <w:spacing/>
+        <w:ind w:hanging="360" w:left="4604"/>
+      </w:pPr>
+      <w:rPr>
+        <w:rFonts w:hint="default" w:ascii="Symbol" w:hAnsi="Symbol" w:eastAsia="Symbol" w:cs="Symbol"/>
+      </w:rPr>
+      <w:start w:val="1"/>
+      <w:suff w:val="tab"/>
+    </w:lvl>
+    <w:lvl w:ilvl="7">
+      <w:isLgl w:val="false"/>
+      <w:lvlJc w:val="left"/>
+      <w:lvlText w:val="o"/>
+      <w:numFmt w:val="bullet"/>
+      <w:pPr>
+        <w:pBdr/>
+        <w:spacing/>
+        <w:ind w:hanging="360" w:left="5324"/>
+      </w:pPr>
+      <w:rPr>
+        <w:rFonts w:hint="default" w:ascii="Courier New" w:hAnsi="Courier New" w:eastAsia="Courier New" w:cs="Courier New"/>
+      </w:rPr>
+      <w:start w:val="1"/>
+      <w:suff w:val="tab"/>
+    </w:lvl>
+    <w:lvl w:ilvl="8">
+      <w:isLgl w:val="false"/>
+      <w:lvlJc w:val="left"/>
+      <w:lvlText w:val="§"/>
+      <w:numFmt w:val="bullet"/>
+      <w:pPr>
+        <w:pBdr/>
+        <w:spacing/>
+        <w:ind w:hanging="360" w:left="6044"/>
+      </w:pPr>
+      <w:rPr>
+        <w:rFonts w:hint="default" w:ascii="Wingdings" w:hAnsi="Wingdings" w:eastAsia="Wingdings" w:cs="Wingdings"/>
+      </w:rPr>
+      <w:start w:val="1"/>
+      <w:suff w:val="tab"/>
+    </w:lvl>
+  </w:abstractNum>
+  <w:abstractNum w:abstractNumId="31">
+    <w:nsid w:val="293B81B2"/>
+    <w:lvl w:ilvl="0">
+      <w:isLgl w:val="false"/>
+      <w:lvlJc w:val="left"/>
+      <w:lvlText w:val="·"/>
+      <w:numFmt w:val="bullet"/>
+      <w:pPr>
+        <w:pBdr/>
+        <w:spacing/>
+        <w:ind w:hanging="360" w:left="284"/>
+      </w:pPr>
+      <w:rPr>
+        <w:rFonts w:ascii="Symbol" w:hAnsi="Symbol" w:eastAsia="Symbol" w:cs="Symbol"/>
+      </w:rPr>
+      <w:start w:val="1"/>
+      <w:suff w:val="tab"/>
+    </w:lvl>
+    <w:lvl w:ilvl="1">
+      <w:isLgl w:val="false"/>
+      <w:lvlJc w:val="left"/>
+      <w:lvlText w:val="o"/>
+      <w:numFmt w:val="bullet"/>
+      <w:pPr>
+        <w:pBdr/>
+        <w:spacing/>
+        <w:ind w:hanging="360" w:left="1004"/>
+      </w:pPr>
+      <w:rPr>
+        <w:rFonts w:hint="default" w:ascii="Courier New" w:hAnsi="Courier New" w:eastAsia="Courier New" w:cs="Courier New"/>
+      </w:rPr>
+      <w:start w:val="1"/>
+      <w:suff w:val="tab"/>
+    </w:lvl>
+    <w:lvl w:ilvl="2">
+      <w:isLgl w:val="false"/>
+      <w:lvlJc w:val="left"/>
+      <w:lvlText w:val="§"/>
+      <w:numFmt w:val="bullet"/>
+      <w:pPr>
+        <w:pBdr/>
+        <w:spacing/>
+        <w:ind w:hanging="360" w:left="1724"/>
+      </w:pPr>
+      <w:rPr>
+        <w:rFonts w:hint="default" w:ascii="Wingdings" w:hAnsi="Wingdings" w:eastAsia="Wingdings" w:cs="Wingdings"/>
+      </w:rPr>
+      <w:start w:val="1"/>
+      <w:suff w:val="tab"/>
+    </w:lvl>
+    <w:lvl w:ilvl="3">
+      <w:isLgl w:val="false"/>
+      <w:lvlJc w:val="left"/>
+      <w:lvlText w:val="·"/>
+      <w:numFmt w:val="bullet"/>
+      <w:pPr>
+        <w:pBdr/>
+        <w:spacing/>
+        <w:ind w:hanging="360" w:left="2444"/>
+      </w:pPr>
+      <w:rPr>
+        <w:rFonts w:hint="default" w:ascii="Symbol" w:hAnsi="Symbol" w:eastAsia="Symbol" w:cs="Symbol"/>
+      </w:rPr>
+      <w:start w:val="1"/>
+      <w:suff w:val="tab"/>
+    </w:lvl>
+    <w:lvl w:ilvl="4">
+      <w:isLgl w:val="false"/>
+      <w:lvlJc w:val="left"/>
+      <w:lvlText w:val="o"/>
+      <w:numFmt w:val="bullet"/>
+      <w:pPr>
+        <w:pBdr/>
+        <w:spacing/>
+        <w:ind w:hanging="360" w:left="3164"/>
+      </w:pPr>
+      <w:rPr>
+        <w:rFonts w:hint="default" w:ascii="Courier New" w:hAnsi="Courier New" w:eastAsia="Courier New" w:cs="Courier New"/>
+      </w:rPr>
+      <w:start w:val="1"/>
+      <w:suff w:val="tab"/>
+    </w:lvl>
+    <w:lvl w:ilvl="5">
+      <w:isLgl w:val="false"/>
+      <w:lvlJc w:val="left"/>
+      <w:lvlText w:val="§"/>
+      <w:numFmt w:val="bullet"/>
+      <w:pPr>
+        <w:pBdr/>
+        <w:spacing/>
+        <w:ind w:hanging="360" w:left="3884"/>
+      </w:pPr>
+      <w:rPr>
+        <w:rFonts w:hint="default" w:ascii="Wingdings" w:hAnsi="Wingdings" w:eastAsia="Wingdings" w:cs="Wingdings"/>
+      </w:rPr>
+      <w:start w:val="1"/>
+      <w:suff w:val="tab"/>
+    </w:lvl>
+    <w:lvl w:ilvl="6">
+      <w:isLgl w:val="false"/>
+      <w:lvlJc w:val="left"/>
+      <w:lvlText w:val="·"/>
+      <w:numFmt w:val="bullet"/>
+      <w:pPr>
+        <w:pBdr/>
+        <w:spacing/>
+        <w:ind w:hanging="360" w:left="4604"/>
+      </w:pPr>
+      <w:rPr>
+        <w:rFonts w:hint="default" w:ascii="Symbol" w:hAnsi="Symbol" w:eastAsia="Symbol" w:cs="Symbol"/>
+      </w:rPr>
+      <w:start w:val="1"/>
+      <w:suff w:val="tab"/>
+    </w:lvl>
+    <w:lvl w:ilvl="7">
+      <w:isLgl w:val="false"/>
+      <w:lvlJc w:val="left"/>
+      <w:lvlText w:val="o"/>
+      <w:numFmt w:val="bullet"/>
+      <w:pPr>
+        <w:pBdr/>
+        <w:spacing/>
+        <w:ind w:hanging="360" w:left="5324"/>
+      </w:pPr>
+      <w:rPr>
+        <w:rFonts w:hint="default" w:ascii="Courier New" w:hAnsi="Courier New" w:eastAsia="Courier New" w:cs="Courier New"/>
+      </w:rPr>
+      <w:start w:val="1"/>
+      <w:suff w:val="tab"/>
+    </w:lvl>
+    <w:lvl w:ilvl="8">
+      <w:isLgl w:val="false"/>
+      <w:lvlJc w:val="left"/>
+      <w:lvlText w:val="§"/>
+      <w:numFmt w:val="bullet"/>
+      <w:pPr>
+        <w:pBdr/>
+        <w:spacing/>
+        <w:ind w:hanging="360" w:left="6044"/>
+      </w:pPr>
+      <w:rPr>
+        <w:rFonts w:hint="default" w:ascii="Wingdings" w:hAnsi="Wingdings" w:eastAsia="Wingdings" w:cs="Wingdings"/>
+      </w:rPr>
+      <w:start w:val="1"/>
+      <w:suff w:val="tab"/>
+    </w:lvl>
+  </w:abstractNum>
+  <w:abstractNum w:abstractNumId="32">
+    <w:nsid w:val="293B81B2"/>
+    <w:lvl w:ilvl="0">
+      <w:isLgl w:val="false"/>
+      <w:lvlJc w:val="left"/>
+      <w:lvlText w:val="·"/>
+      <w:numFmt w:val="bullet"/>
+      <w:pPr>
+        <w:pBdr/>
+        <w:spacing/>
+        <w:ind w:hanging="360" w:left="284"/>
+      </w:pPr>
+      <w:rPr>
+        <w:rFonts w:ascii="Symbol" w:hAnsi="Symbol" w:eastAsia="Symbol" w:cs="Symbol"/>
+      </w:rPr>
+      <w:start w:val="1"/>
+      <w:suff w:val="tab"/>
+    </w:lvl>
+    <w:lvl w:ilvl="1">
+      <w:isLgl w:val="false"/>
+      <w:lvlJc w:val="left"/>
+      <w:lvlText w:val="o"/>
+      <w:numFmt w:val="bullet"/>
+      <w:pPr>
+        <w:pBdr/>
+        <w:spacing/>
+        <w:ind w:hanging="360" w:left="1004"/>
+      </w:pPr>
+      <w:rPr>
+        <w:rFonts w:hint="default" w:ascii="Courier New" w:hAnsi="Courier New" w:eastAsia="Courier New" w:cs="Courier New"/>
+      </w:rPr>
+      <w:start w:val="1"/>
+      <w:suff w:val="tab"/>
+    </w:lvl>
+    <w:lvl w:ilvl="2">
+      <w:isLgl w:val="false"/>
+      <w:lvlJc w:val="left"/>
+      <w:lvlText w:val="§"/>
+      <w:numFmt w:val="bullet"/>
+      <w:pPr>
+        <w:pBdr/>
+        <w:spacing/>
+        <w:ind w:hanging="360" w:left="1724"/>
+      </w:pPr>
+      <w:rPr>
+        <w:rFonts w:hint="default" w:ascii="Wingdings" w:hAnsi="Wingdings" w:eastAsia="Wingdings" w:cs="Wingdings"/>
+      </w:rPr>
+      <w:start w:val="1"/>
+      <w:suff w:val="tab"/>
+    </w:lvl>
+    <w:lvl w:ilvl="3">
+      <w:isLgl w:val="false"/>
+      <w:lvlJc w:val="left"/>
+      <w:lvlText w:val="·"/>
+      <w:numFmt w:val="bullet"/>
+      <w:pPr>
+        <w:pBdr/>
+        <w:spacing/>
+        <w:ind w:hanging="360" w:left="2444"/>
+      </w:pPr>
+      <w:rPr>
+        <w:rFonts w:hint="default" w:ascii="Symbol" w:hAnsi="Symbol" w:eastAsia="Symbol" w:cs="Symbol"/>
+      </w:rPr>
+      <w:start w:val="1"/>
+      <w:suff w:val="tab"/>
+    </w:lvl>
+    <w:lvl w:ilvl="4">
+      <w:isLgl w:val="false"/>
+      <w:lvlJc w:val="left"/>
+      <w:lvlText w:val="o"/>
+      <w:numFmt w:val="bullet"/>
+      <w:pPr>
+        <w:pBdr/>
+        <w:spacing/>
+        <w:ind w:hanging="360" w:left="3164"/>
+      </w:pPr>
+      <w:rPr>
+        <w:rFonts w:hint="default" w:ascii="Courier New" w:hAnsi="Courier New" w:eastAsia="Courier New" w:cs="Courier New"/>
+      </w:rPr>
+      <w:start w:val="1"/>
+      <w:suff w:val="tab"/>
+    </w:lvl>
+    <w:lvl w:ilvl="5">
+      <w:isLgl w:val="false"/>
+      <w:lvlJc w:val="left"/>
+      <w:lvlText w:val="§"/>
+      <w:numFmt w:val="bullet"/>
+      <w:pPr>
+        <w:pBdr/>
+        <w:spacing/>
+        <w:ind w:hanging="360" w:left="3884"/>
+      </w:pPr>
+      <w:rPr>
+        <w:rFonts w:hint="default" w:ascii="Wingdings" w:hAnsi="Wingdings" w:eastAsia="Wingdings" w:cs="Wingdings"/>
+      </w:rPr>
+      <w:start w:val="1"/>
+      <w:suff w:val="tab"/>
+    </w:lvl>
+    <w:lvl w:ilvl="6">
+      <w:isLgl w:val="false"/>
+      <w:lvlJc w:val="left"/>
+      <w:lvlText w:val="·"/>
+      <w:numFmt w:val="bullet"/>
+      <w:pPr>
+        <w:pBdr/>
+        <w:spacing/>
+        <w:ind w:hanging="360" w:left="4604"/>
+      </w:pPr>
+      <w:rPr>
+        <w:rFonts w:hint="default" w:ascii="Symbol" w:hAnsi="Symbol" w:eastAsia="Symbol" w:cs="Symbol"/>
+      </w:rPr>
+      <w:start w:val="1"/>
+      <w:suff w:val="tab"/>
+    </w:lvl>
+    <w:lvl w:ilvl="7">
+      <w:isLgl w:val="false"/>
+      <w:lvlJc w:val="left"/>
+      <w:lvlText w:val="o"/>
+      <w:numFmt w:val="bullet"/>
+      <w:pPr>
+        <w:pBdr/>
+        <w:spacing/>
+        <w:ind w:hanging="360" w:left="5324"/>
+      </w:pPr>
+      <w:rPr>
+        <w:rFonts w:hint="default" w:ascii="Courier New" w:hAnsi="Courier New" w:eastAsia="Courier New" w:cs="Courier New"/>
+      </w:rPr>
+      <w:start w:val="1"/>
+      <w:suff w:val="tab"/>
+    </w:lvl>
+    <w:lvl w:ilvl="8">
+      <w:isLgl w:val="false"/>
+      <w:lvlJc w:val="left"/>
+      <w:lvlText w:val="§"/>
+      <w:numFmt w:val="bullet"/>
+      <w:pPr>
+        <w:pBdr/>
+        <w:spacing/>
+        <w:ind w:hanging="360" w:left="6044"/>
+      </w:pPr>
+      <w:rPr>
+        <w:rFonts w:hint="default" w:ascii="Wingdings" w:hAnsi="Wingdings" w:eastAsia="Wingdings" w:cs="Wingdings"/>
+      </w:rPr>
+      <w:start w:val="1"/>
+      <w:suff w:val="tab"/>
+    </w:lvl>
+  </w:abstractNum>
+  <w:abstractNum w:abstractNumId="33">
+    <w:nsid w:val="293B81B2"/>
+    <w:lvl w:ilvl="0">
+      <w:isLgl w:val="false"/>
+      <w:lvlJc w:val="left"/>
+      <w:lvlText w:val="·"/>
+      <w:numFmt w:val="bullet"/>
+      <w:pPr>
+        <w:pBdr/>
+        <w:spacing/>
+        <w:ind w:hanging="360" w:left="284"/>
+      </w:pPr>
+      <w:rPr>
+        <w:rFonts w:ascii="Symbol" w:hAnsi="Symbol" w:eastAsia="Symbol" w:cs="Symbol"/>
+      </w:rPr>
+      <w:start w:val="1"/>
+      <w:suff w:val="tab"/>
+    </w:lvl>
+    <w:lvl w:ilvl="1">
+      <w:isLgl w:val="false"/>
+      <w:lvlJc w:val="left"/>
+      <w:lvlText w:val="o"/>
+      <w:numFmt w:val="bullet"/>
+      <w:pPr>
+        <w:pBdr/>
+        <w:spacing/>
+        <w:ind w:hanging="360" w:left="1004"/>
+      </w:pPr>
+      <w:rPr>
+        <w:rFonts w:hint="default" w:ascii="Courier New" w:hAnsi="Courier New" w:eastAsia="Courier New" w:cs="Courier New"/>
+      </w:rPr>
+      <w:start w:val="1"/>
+      <w:suff w:val="tab"/>
+    </w:lvl>
+    <w:lvl w:ilvl="2">
+      <w:isLgl w:val="false"/>
+      <w:lvlJc w:val="left"/>
+      <w:lvlText w:val="§"/>
+      <w:numFmt w:val="bullet"/>
+      <w:pPr>
+        <w:pBdr/>
+        <w:spacing/>
+        <w:ind w:hanging="360" w:left="1724"/>
+      </w:pPr>
+      <w:rPr>
+        <w:rFonts w:hint="default" w:ascii="Wingdings" w:hAnsi="Wingdings" w:eastAsia="Wingdings" w:cs="Wingdings"/>
+      </w:rPr>
+      <w:start w:val="1"/>
+      <w:suff w:val="tab"/>
+    </w:lvl>
+    <w:lvl w:ilvl="3">
+      <w:isLgl w:val="false"/>
+      <w:lvlJc w:val="left"/>
+      <w:lvlText w:val="·"/>
+      <w:numFmt w:val="bullet"/>
+      <w:pPr>
+        <w:pBdr/>
+        <w:spacing/>
+        <w:ind w:hanging="360" w:left="2444"/>
+      </w:pPr>
+      <w:rPr>
+        <w:rFonts w:hint="default" w:ascii="Symbol" w:hAnsi="Symbol" w:eastAsia="Symbol" w:cs="Symbol"/>
+      </w:rPr>
+      <w:start w:val="1"/>
+      <w:suff w:val="tab"/>
+    </w:lvl>
+    <w:lvl w:ilvl="4">
+      <w:isLgl w:val="false"/>
+      <w:lvlJc w:val="left"/>
+      <w:lvlText w:val="o"/>
+      <w:numFmt w:val="bullet"/>
+      <w:pPr>
+        <w:pBdr/>
+        <w:spacing/>
+        <w:ind w:hanging="360" w:left="3164"/>
+      </w:pPr>
+      <w:rPr>
+        <w:rFonts w:hint="default" w:ascii="Courier New" w:hAnsi="Courier New" w:eastAsia="Courier New" w:cs="Courier New"/>
+      </w:rPr>
+      <w:start w:val="1"/>
+      <w:suff w:val="tab"/>
+    </w:lvl>
+    <w:lvl w:ilvl="5">
+      <w:isLgl w:val="false"/>
+      <w:lvlJc w:val="left"/>
+      <w:lvlText w:val="§"/>
+      <w:numFmt w:val="bullet"/>
+      <w:pPr>
+        <w:pBdr/>
+        <w:spacing/>
+        <w:ind w:hanging="360" w:left="3884"/>
+      </w:pPr>
+      <w:rPr>
+        <w:rFonts w:hint="default" w:ascii="Wingdings" w:hAnsi="Wingdings" w:eastAsia="Wingdings" w:cs="Wingdings"/>
+      </w:rPr>
+      <w:start w:val="1"/>
+      <w:suff w:val="tab"/>
+    </w:lvl>
+    <w:lvl w:ilvl="6">
+      <w:isLgl w:val="false"/>
+      <w:lvlJc w:val="left"/>
+      <w:lvlText w:val="·"/>
+      <w:numFmt w:val="bullet"/>
+      <w:pPr>
+        <w:pBdr/>
+        <w:spacing/>
+        <w:ind w:hanging="360" w:left="4604"/>
+      </w:pPr>
+      <w:rPr>
+        <w:rFonts w:hint="default" w:ascii="Symbol" w:hAnsi="Symbol" w:eastAsia="Symbol" w:cs="Symbol"/>
+      </w:rPr>
+      <w:start w:val="1"/>
+      <w:suff w:val="tab"/>
+    </w:lvl>
+    <w:lvl w:ilvl="7">
+      <w:isLgl w:val="false"/>
+      <w:lvlJc w:val="left"/>
+      <w:lvlText w:val="o"/>
+      <w:numFmt w:val="bullet"/>
+      <w:pPr>
+        <w:pBdr/>
+        <w:spacing/>
+        <w:ind w:hanging="360" w:left="5324"/>
+      </w:pPr>
+      <w:rPr>
+        <w:rFonts w:hint="default" w:ascii="Courier New" w:hAnsi="Courier New" w:eastAsia="Courier New" w:cs="Courier New"/>
+      </w:rPr>
+      <w:start w:val="1"/>
+      <w:suff w:val="tab"/>
+    </w:lvl>
+    <w:lvl w:ilvl="8">
+      <w:isLgl w:val="false"/>
+      <w:lvlJc w:val="left"/>
+      <w:lvlText w:val="§"/>
+      <w:numFmt w:val="bullet"/>
+      <w:pPr>
+        <w:pBdr/>
+        <w:spacing/>
+        <w:ind w:hanging="360" w:left="6044"/>
+      </w:pPr>
+      <w:rPr>
+        <w:rFonts w:hint="default" w:ascii="Wingdings" w:hAnsi="Wingdings" w:eastAsia="Wingdings" w:cs="Wingdings"/>
+      </w:rPr>
+      <w:start w:val="1"/>
+      <w:suff w:val="tab"/>
+    </w:lvl>
+  </w:abstractNum>
+  <w:abstractNum w:abstractNumId="34">
+    <w:nsid w:val="293B81B2"/>
+    <w:lvl w:ilvl="0">
+      <w:isLgl w:val="false"/>
+      <w:lvlJc w:val="left"/>
+      <w:lvlText w:val="·"/>
+      <w:numFmt w:val="bullet"/>
+      <w:pPr>
+        <w:pBdr/>
+        <w:spacing/>
+        <w:ind w:hanging="360" w:left="284"/>
+      </w:pPr>
+      <w:rPr>
+        <w:rFonts w:ascii="Symbol" w:hAnsi="Symbol" w:eastAsia="Symbol" w:cs="Symbol"/>
+      </w:rPr>
+      <w:start w:val="1"/>
+      <w:suff w:val="tab"/>
+    </w:lvl>
+    <w:lvl w:ilvl="1">
+      <w:isLgl w:val="false"/>
+      <w:lvlJc w:val="left"/>
+      <w:lvlText w:val="o"/>
+      <w:numFmt w:val="bullet"/>
+      <w:pPr>
+        <w:pBdr/>
+        <w:spacing/>
+        <w:ind w:hanging="360" w:left="1004"/>
+      </w:pPr>
+      <w:rPr>
+        <w:rFonts w:hint="default" w:ascii="Courier New" w:hAnsi="Courier New" w:eastAsia="Courier New" w:cs="Courier New"/>
+      </w:rPr>
+      <w:start w:val="1"/>
+      <w:suff w:val="tab"/>
+    </w:lvl>
+    <w:lvl w:ilvl="2">
+      <w:isLgl w:val="false"/>
+      <w:lvlJc w:val="left"/>
+      <w:lvlText w:val="§"/>
+      <w:numFmt w:val="bullet"/>
+      <w:pPr>
+        <w:pBdr/>
+        <w:spacing/>
+        <w:ind w:hanging="360" w:left="1724"/>
+      </w:pPr>
+      <w:rPr>
+        <w:rFonts w:hint="default" w:ascii="Wingdings" w:hAnsi="Wingdings" w:eastAsia="Wingdings" w:cs="Wingdings"/>
+      </w:rPr>
+      <w:start w:val="1"/>
+      <w:suff w:val="tab"/>
+    </w:lvl>
+    <w:lvl w:ilvl="3">
+      <w:isLgl w:val="false"/>
+      <w:lvlJc w:val="left"/>
+      <w:lvlText w:val="·"/>
+      <w:numFmt w:val="bullet"/>
+      <w:pPr>
+        <w:pBdr/>
+        <w:spacing/>
+        <w:ind w:hanging="360" w:left="2444"/>
+      </w:pPr>
+      <w:rPr>
+        <w:rFonts w:hint="default" w:ascii="Symbol" w:hAnsi="Symbol" w:eastAsia="Symbol" w:cs="Symbol"/>
+      </w:rPr>
+      <w:start w:val="1"/>
+      <w:suff w:val="tab"/>
+    </w:lvl>
+    <w:lvl w:ilvl="4">
+      <w:isLgl w:val="false"/>
+      <w:lvlJc w:val="left"/>
+      <w:lvlText w:val="o"/>
+      <w:numFmt w:val="bullet"/>
+      <w:pPr>
+        <w:pBdr/>
+        <w:spacing/>
+        <w:ind w:hanging="360" w:left="3164"/>
+      </w:pPr>
+      <w:rPr>
+        <w:rFonts w:hint="default" w:ascii="Courier New" w:hAnsi="Courier New" w:eastAsia="Courier New" w:cs="Courier New"/>
+      </w:rPr>
+      <w:start w:val="1"/>
+      <w:suff w:val="tab"/>
+    </w:lvl>
+    <w:lvl w:ilvl="5">
+      <w:isLgl w:val="false"/>
+      <w:lvlJc w:val="left"/>
+      <w:lvlText w:val="§"/>
+      <w:numFmt w:val="bullet"/>
+      <w:pPr>
+        <w:pBdr/>
+        <w:spacing/>
+        <w:ind w:hanging="360" w:left="3884"/>
+      </w:pPr>
+      <w:rPr>
+        <w:rFonts w:hint="default" w:ascii="Wingdings" w:hAnsi="Wingdings" w:eastAsia="Wingdings" w:cs="Wingdings"/>
+      </w:rPr>
+      <w:start w:val="1"/>
+      <w:suff w:val="tab"/>
+    </w:lvl>
+    <w:lvl w:ilvl="6">
+      <w:isLgl w:val="false"/>
+      <w:lvlJc w:val="left"/>
+      <w:lvlText w:val="·"/>
+      <w:numFmt w:val="bullet"/>
+      <w:pPr>
+        <w:pBdr/>
+        <w:spacing/>
+        <w:ind w:hanging="360" w:left="4604"/>
+      </w:pPr>
+      <w:rPr>
+        <w:rFonts w:hint="default" w:ascii="Symbol" w:hAnsi="Symbol" w:eastAsia="Symbol" w:cs="Symbol"/>
+      </w:rPr>
+      <w:start w:val="1"/>
+      <w:suff w:val="tab"/>
+    </w:lvl>
+    <w:lvl w:ilvl="7">
+      <w:isLgl w:val="false"/>
+      <w:lvlJc w:val="left"/>
+      <w:lvlText w:val="o"/>
+      <w:numFmt w:val="bullet"/>
+      <w:pPr>
+        <w:pBdr/>
+        <w:spacing/>
+        <w:ind w:hanging="360" w:left="5324"/>
+      </w:pPr>
+      <w:rPr>
+        <w:rFonts w:hint="default" w:ascii="Courier New" w:hAnsi="Courier New" w:eastAsia="Courier New" w:cs="Courier New"/>
+      </w:rPr>
+      <w:start w:val="1"/>
+      <w:suff w:val="tab"/>
+    </w:lvl>
+    <w:lvl w:ilvl="8">
+      <w:isLgl w:val="false"/>
+      <w:lvlJc w:val="left"/>
+      <w:lvlText w:val="§"/>
+      <w:numFmt w:val="bullet"/>
+      <w:pPr>
+        <w:pBdr/>
+        <w:spacing/>
+        <w:ind w:hanging="360" w:left="6044"/>
+      </w:pPr>
+      <w:rPr>
+        <w:rFonts w:hint="default" w:ascii="Wingdings" w:hAnsi="Wingdings" w:eastAsia="Wingdings" w:cs="Wingdings"/>
+      </w:rPr>
+      <w:start w:val="1"/>
+      <w:suff w:val="tab"/>
+    </w:lvl>
+  </w:abstractNum>
+  <w:abstractNum w:abstractNumId="35">
+    <w:nsid w:val="1DD39F0F"/>
+    <w:lvl w:ilvl="0">
+      <w:isLgl w:val="false"/>
+      <w:lvlJc w:val="left"/>
+      <w:lvlText w:val="–"/>
+      <w:numFmt w:val="bullet"/>
+      <w:pPr>
+        <w:pBdr/>
+        <w:spacing/>
+        <w:ind w:hanging="360" w:left="720"/>
+      </w:pPr>
+      <w:rPr>
+        <w:rFonts w:ascii="Arial" w:hAnsi="Arial" w:eastAsia="Arial" w:cs="Arial"/>
+      </w:rPr>
+      <w:start w:val="1"/>
+      <w:suff w:val="tab"/>
+    </w:lvl>
+    <w:lvl w:ilvl="1">
+      <w:isLgl w:val="false"/>
+      <w:lvlJc w:val="left"/>
+      <w:lvlText w:val="o"/>
+      <w:numFmt w:val="bullet"/>
+      <w:pPr>
+        <w:pBdr/>
+        <w:spacing/>
+        <w:ind w:hanging="360" w:left="1440"/>
+      </w:pPr>
+      <w:rPr>
+        <w:rFonts w:hint="default" w:ascii="Courier New" w:hAnsi="Courier New" w:eastAsia="Courier New" w:cs="Courier New"/>
+      </w:rPr>
+      <w:start w:val="1"/>
+      <w:suff w:val="tab"/>
+    </w:lvl>
+    <w:lvl w:ilvl="2">
+      <w:isLgl w:val="false"/>
+      <w:lvlJc w:val="left"/>
+      <w:lvlText w:val="§"/>
+      <w:numFmt w:val="bullet"/>
+      <w:pPr>
+        <w:pBdr/>
+        <w:spacing/>
+        <w:ind w:hanging="360" w:left="2160"/>
+      </w:pPr>
+      <w:rPr>
+        <w:rFonts w:hint="default" w:ascii="Wingdings" w:hAnsi="Wingdings" w:eastAsia="Wingdings" w:cs="Wingdings"/>
+      </w:rPr>
+      <w:start w:val="1"/>
+      <w:suff w:val="tab"/>
+    </w:lvl>
+    <w:lvl w:ilvl="3">
+      <w:isLgl w:val="false"/>
+      <w:lvlJc w:val="left"/>
+      <w:lvlText w:val="·"/>
+      <w:numFmt w:val="bullet"/>
+      <w:pPr>
+        <w:pBdr/>
+        <w:spacing/>
+        <w:ind w:hanging="360" w:left="2880"/>
+      </w:pPr>
+      <w:rPr>
+        <w:rFonts w:hint="default" w:ascii="Symbol" w:hAnsi="Symbol" w:eastAsia="Symbol" w:cs="Symbol"/>
+      </w:rPr>
+      <w:start w:val="1"/>
+      <w:suff w:val="tab"/>
+    </w:lvl>
+    <w:lvl w:ilvl="4">
+      <w:isLgl w:val="false"/>
+      <w:lvlJc w:val="left"/>
+      <w:lvlText w:val="o"/>
+      <w:numFmt w:val="bullet"/>
+      <w:pPr>
+        <w:pBdr/>
+        <w:spacing/>
+        <w:ind w:hanging="360" w:left="3600"/>
+      </w:pPr>
+      <w:rPr>
+        <w:rFonts w:hint="default" w:ascii="Courier New" w:hAnsi="Courier New" w:eastAsia="Courier New" w:cs="Courier New"/>
+      </w:rPr>
+      <w:start w:val="1"/>
+      <w:suff w:val="tab"/>
+    </w:lvl>
+    <w:lvl w:ilvl="5">
+      <w:isLgl w:val="false"/>
+      <w:lvlJc w:val="left"/>
+      <w:lvlText w:val="§"/>
+      <w:numFmt w:val="bullet"/>
+      <w:pPr>
+        <w:pBdr/>
+        <w:spacing/>
+        <w:ind w:hanging="360" w:left="4320"/>
+      </w:pPr>
+      <w:rPr>
+        <w:rFonts w:hint="default" w:ascii="Wingdings" w:hAnsi="Wingdings" w:eastAsia="Wingdings" w:cs="Wingdings"/>
+      </w:rPr>
+      <w:start w:val="1"/>
+      <w:suff w:val="tab"/>
+    </w:lvl>
+    <w:lvl w:ilvl="6">
+      <w:isLgl w:val="false"/>
+      <w:lvlJc w:val="left"/>
+      <w:lvlText w:val="·"/>
+      <w:numFmt w:val="bullet"/>
+      <w:pPr>
+        <w:pBdr/>
+        <w:spacing/>
+        <w:ind w:hanging="360" w:left="5040"/>
+      </w:pPr>
+      <w:rPr>
+        <w:rFonts w:hint="default" w:ascii="Symbol" w:hAnsi="Symbol" w:eastAsia="Symbol" w:cs="Symbol"/>
+      </w:rPr>
+      <w:start w:val="1"/>
+      <w:suff w:val="tab"/>
+    </w:lvl>
+    <w:lvl w:ilvl="7">
+      <w:isLgl w:val="false"/>
+      <w:lvlJc w:val="left"/>
+      <w:lvlText w:val="o"/>
+      <w:numFmt w:val="bullet"/>
+      <w:pPr>
+        <w:pBdr/>
+        <w:spacing/>
+        <w:ind w:hanging="360" w:left="5760"/>
+      </w:pPr>
+      <w:rPr>
+        <w:rFonts w:hint="default" w:ascii="Courier New" w:hAnsi="Courier New" w:eastAsia="Courier New" w:cs="Courier New"/>
+      </w:rPr>
+      <w:start w:val="1"/>
+      <w:suff w:val="tab"/>
+    </w:lvl>
+    <w:lvl w:ilvl="8">
+      <w:isLgl w:val="false"/>
+      <w:lvlJc w:val="left"/>
+      <w:lvlText w:val="§"/>
+      <w:numFmt w:val="bullet"/>
+      <w:pPr>
+        <w:pBdr/>
+        <w:spacing/>
+        <w:ind w:hanging="360" w:left="6480"/>
       </w:pPr>
       <w:rPr>
         <w:rFonts w:hint="default" w:ascii="Wingdings" w:hAnsi="Wingdings" w:eastAsia="Wingdings" w:cs="Wingdings"/>
@@ -5868,6 +7707,33 @@
   </w:num>
   <w:num w:numId="27">
     <w:abstractNumId w:val="26"/>
+  </w:num>
+  <w:num w:numId="28">
+    <w:abstractNumId w:val="27"/>
+  </w:num>
+  <w:num w:numId="29">
+    <w:abstractNumId w:val="28"/>
+  </w:num>
+  <w:num w:numId="30">
+    <w:abstractNumId w:val="29"/>
+  </w:num>
+  <w:num w:numId="31">
+    <w:abstractNumId w:val="30"/>
+  </w:num>
+  <w:num w:numId="32">
+    <w:abstractNumId w:val="31"/>
+  </w:num>
+  <w:num w:numId="33">
+    <w:abstractNumId w:val="32"/>
+  </w:num>
+  <w:num w:numId="34">
+    <w:abstractNumId w:val="33"/>
+  </w:num>
+  <w:num w:numId="35">
+    <w:abstractNumId w:val="34"/>
+  </w:num>
+  <w:num w:numId="36">
+    <w:abstractNumId w:val="35"/>
   </w:num>
 </w:numbering>
 </file>

</xml_diff>